<commit_message>
Lemmatiesierung wurde hinzugefügt, zudem wurde ein fehler in der csv datei entdeckt. welcher aber nicht weiter beachtet wird.
</commit_message>
<xml_diff>
--- a/Borchers-Marcel.Peter_IU14077409_ProjektDataAnalysis_P2_A.docx
+++ b/Borchers-Marcel.Peter_IU14077409_ProjektDataAnalysis_P2_A.docx
@@ -778,6 +778,174 @@
         <w:t>Das können wir später noch an deinen tatsächlichen Arbeitsverlauf anpassen.</w:t>
       </w:r>
     </w:p>
+    <w:p/>
+    <w:p>
+      <w:pPr>
+        <w:rPr>
+          <w:rFonts w:ascii="Times New Roman" w:eastAsia="Times New Roman" w:hAnsi="Symbol" w:cs="Times New Roman"/>
+          <w:b/>
+          <w:color w:val="auto"/>
+          <w:sz w:val="24"/>
+          <w:lang w:eastAsia="de-DE"/>
+        </w:rPr>
+      </w:pPr>
+      <w:r>
+        <w:t xml:space="preserve">Im </w:t>
+      </w:r>
+      <w:proofErr w:type="spellStart"/>
+      <w:r>
+        <w:t>weitern</w:t>
+      </w:r>
+      <w:proofErr w:type="spellEnd"/>
+      <w:r>
+        <w:t xml:space="preserve"> verlauf ist mir aufgefallen, das </w:t>
+      </w:r>
+      <w:proofErr w:type="spellStart"/>
+      <w:r>
+        <w:t>pandas</w:t>
+      </w:r>
+      <w:proofErr w:type="spellEnd"/>
+      <w:r>
+        <w:t xml:space="preserve"> nicht alle daten </w:t>
+      </w:r>
+      <w:proofErr w:type="spellStart"/>
+      <w:r>
+        <w:t>sätze</w:t>
+      </w:r>
+      <w:proofErr w:type="spellEnd"/>
+      <w:r>
+        <w:t xml:space="preserve"> erkennt, scheinbar </w:t>
+      </w:r>
+      <w:proofErr w:type="spellStart"/>
+      <w:r>
+        <w:t>vllt</w:t>
+      </w:r>
+      <w:proofErr w:type="spellEnd"/>
+      <w:r>
+        <w:t xml:space="preserve"> ein </w:t>
+      </w:r>
+      <w:proofErr w:type="spellStart"/>
+      <w:r>
+        <w:t>format</w:t>
+      </w:r>
+      <w:proofErr w:type="spellEnd"/>
+      <w:r>
+        <w:t xml:space="preserve"> </w:t>
+      </w:r>
+      <w:proofErr w:type="spellStart"/>
+      <w:r>
+        <w:t>fehler</w:t>
+      </w:r>
+      <w:proofErr w:type="spellEnd"/>
+      <w:r>
+        <w:t xml:space="preserve"> in der </w:t>
+      </w:r>
+      <w:proofErr w:type="spellStart"/>
+      <w:r>
+        <w:t>rohdatei</w:t>
+      </w:r>
+      <w:proofErr w:type="spellEnd"/>
+      <w:r>
+        <w:t>?</w:t>
+      </w:r>
+      <w:r>
+        <w:rPr>
+          <w:rFonts w:ascii="Times New Roman" w:eastAsia="Times New Roman" w:hAnsi="Symbol" w:cs="Times New Roman"/>
+          <w:b/>
+          <w:color w:val="auto"/>
+          <w:sz w:val="24"/>
+          <w:lang w:eastAsia="de-DE"/>
+        </w:rPr>
+        <w:t xml:space="preserve"> </w:t>
+      </w:r>
+    </w:p>
+    <w:p>
+      <w:r>
+        <w:t xml:space="preserve">  41.422 Zeilen in der </w:t>
+      </w:r>
+      <w:proofErr w:type="spellStart"/>
+      <w:r>
+        <w:t>Rohdatei</w:t>
+      </w:r>
+      <w:proofErr w:type="spellEnd"/>
+    </w:p>
+    <w:p>
+      <w:proofErr w:type="gramStart"/>
+      <w:r>
+        <w:t>  34.660</w:t>
+      </w:r>
+      <w:proofErr w:type="gramEnd"/>
+      <w:r>
+        <w:t xml:space="preserve"> Zeilen nach dem Einlesen mit Pandas</w:t>
+      </w:r>
+    </w:p>
+    <w:p>
+      <w:proofErr w:type="gramStart"/>
+      <w:r>
+        <w:lastRenderedPageBreak/>
+        <w:t>  34.659</w:t>
+      </w:r>
+      <w:proofErr w:type="gramEnd"/>
+      <w:r>
+        <w:t xml:space="preserve"> Bewertungen nach dem Entfernen der einen fehlenden Rezension</w:t>
+      </w:r>
+      <w:r>
+        <w:br/>
+      </w:r>
+      <w:r>
+        <w:br/>
+        <w:t xml:space="preserve">einige </w:t>
+      </w:r>
+      <w:proofErr w:type="spellStart"/>
+      <w:r>
+        <w:t>zeilen</w:t>
+      </w:r>
+      <w:proofErr w:type="spellEnd"/>
+      <w:r>
+        <w:t xml:space="preserve"> sind mit dem </w:t>
+      </w:r>
+      <w:proofErr w:type="spellStart"/>
+      <w:r>
+        <w:t>namen</w:t>
+      </w:r>
+      <w:proofErr w:type="spellEnd"/>
+      <w:r>
+        <w:t xml:space="preserve"> der </w:t>
+      </w:r>
+      <w:proofErr w:type="spellStart"/>
+      <w:r>
+        <w:t>produkte</w:t>
+      </w:r>
+      <w:proofErr w:type="spellEnd"/>
+      <w:r>
+        <w:t xml:space="preserve"> komisch formatiert. Dadurch haben wir mehr </w:t>
+      </w:r>
+      <w:proofErr w:type="spellStart"/>
+      <w:r>
+        <w:t>zeilen</w:t>
+      </w:r>
+      <w:proofErr w:type="spellEnd"/>
+      <w:r>
+        <w:t xml:space="preserve"> als Daten, </w:t>
+      </w:r>
+      <w:r>
+        <w:t xml:space="preserve">die Reviews werden aber korrekt </w:t>
+      </w:r>
+      <w:proofErr w:type="spellStart"/>
+      <w:r>
+        <w:t>einglesen</w:t>
+      </w:r>
+      <w:proofErr w:type="spellEnd"/>
+      <w:r>
+        <w:t>.</w:t>
+      </w:r>
+    </w:p>
+    <w:p>
+      <w:r>
+        <w:t xml:space="preserve"> </w:t>
+      </w:r>
+    </w:p>
+    <w:p/>
     <w:p/>
     <w:sectPr>
       <w:headerReference w:type="default" r:id="rId14"/>
@@ -4849,6 +5017,7 @@
   <w:style w:type="character" w:default="1" w:styleId="Absatz-Standardschriftart">
     <w:name w:val="Default Paragraph Font"/>
     <w:uiPriority w:val="1"/>
+    <w:semiHidden/>
     <w:unhideWhenUsed/>
   </w:style>
   <w:style w:type="table" w:default="1" w:styleId="NormaleTabelle">

</xml_diff>